<commit_message>
Servis yazdır/excel, migration düzeltmeleri, yetim veri temizliği, KDV sıfırlama iyileştirmeleri
</commit_message>
<xml_diff>
--- a/app/static/templates/Kiralama_Formu_TASLAK.docx
+++ b/app/static/templates/Kiralama_Formu_TASLAK.docx
@@ -8257,13 +8257,7 @@
               <w:rPr>
                 <w:sz w:val="16"/>
               </w:rPr>
-              <w:t xml:space="preserve"> </w:t>
-            </w:r>
-            <w:r>
-              <w:rPr>
-                <w:sz w:val="16"/>
-              </w:rPr>
-              <w:t>FATURA</w:t>
+              <w:t xml:space="preserve"> FATURA</w:t>
             </w:r>
             <w:r>
               <w:rPr>
@@ -8387,14 +8381,6 @@
           <w:sz w:val="14"/>
         </w:rPr>
       </w:pPr>
-    </w:p>
-    <w:p>
-      <w:pPr>
-        <w:rPr>
-          <w:rFonts w:ascii="Times New Roman"/>
-          <w:sz w:val="14"/>
-        </w:rPr>
-      </w:pPr>
       <w:r>
         <w:rPr>
           <w:b/>
@@ -8404,16 +8390,16 @@
         <mc:AlternateContent>
           <mc:Choice Requires="wps">
             <w:drawing>
-              <wp:anchor distT="45720" distB="45720" distL="114300" distR="114300" simplePos="0" relativeHeight="251664384" behindDoc="1" locked="0" layoutInCell="1" allowOverlap="1" wp14:anchorId="3F8580F0" wp14:editId="472F058D">
+              <wp:anchor distT="45720" distB="45720" distL="114300" distR="114300" simplePos="0" relativeHeight="251664384" behindDoc="1" locked="0" layoutInCell="1" allowOverlap="1" wp14:anchorId="3F8580F0" wp14:editId="4BD80362">
                 <wp:simplePos x="0" y="0"/>
                 <wp:positionH relativeFrom="column">
-                  <wp:posOffset>3940175</wp:posOffset>
+                  <wp:posOffset>3975100</wp:posOffset>
                 </wp:positionH>
                 <wp:positionV relativeFrom="paragraph">
-                  <wp:posOffset>35560</wp:posOffset>
+                  <wp:posOffset>63500</wp:posOffset>
                 </wp:positionV>
-                <wp:extent cx="2989385" cy="393896"/>
-                <wp:effectExtent l="0" t="0" r="1905" b="6350"/>
+                <wp:extent cx="2989385" cy="697230"/>
+                <wp:effectExtent l="0" t="0" r="1905" b="7620"/>
                 <wp:wrapNone/>
                 <wp:docPr id="2124712204" name="Metin Kutusu 2"/>
                 <wp:cNvGraphicFramePr>
@@ -8428,7 +8414,7 @@
                       <wps:spPr bwMode="auto">
                         <a:xfrm>
                           <a:off x="0" y="0"/>
-                          <a:ext cx="2989385" cy="393896"/>
+                          <a:ext cx="2989385" cy="697230"/>
                         </a:xfrm>
                         <a:prstGeom prst="rect">
                           <a:avLst/>
@@ -8568,7 +8554,7 @@
           </mc:Choice>
           <mc:Fallback>
             <w:pict>
-              <v:shape w14:anchorId="3F8580F0" id="_x0000_s1029" type="#_x0000_t202" style="position:absolute;margin-left:310.25pt;margin-top:2.8pt;width:235.4pt;height:31pt;z-index:-251652096;visibility:visible;mso-wrap-style:square;mso-width-percent:0;mso-height-percent:0;mso-wrap-distance-left:9pt;mso-wrap-distance-top:3.6pt;mso-wrap-distance-right:9pt;mso-wrap-distance-bottom:3.6pt;mso-position-horizontal:absolute;mso-position-horizontal-relative:text;mso-position-vertical:absolute;mso-position-vertical-relative:text;mso-width-percent:0;mso-height-percent:0;mso-width-relative:margin;mso-height-relative:margin;v-text-anchor:middle" o:gfxdata="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" stroked="f">
+              <v:shape w14:anchorId="3F8580F0" id="_x0000_s1029" type="#_x0000_t202" style="position:absolute;margin-left:313pt;margin-top:5pt;width:235.4pt;height:54.9pt;z-index:-251652096;visibility:visible;mso-wrap-style:square;mso-width-percent:0;mso-height-percent:0;mso-wrap-distance-left:9pt;mso-wrap-distance-top:3.6pt;mso-wrap-distance-right:9pt;mso-wrap-distance-bottom:3.6pt;mso-position-horizontal:absolute;mso-position-horizontal-relative:text;mso-position-vertical:absolute;mso-position-vertical-relative:text;mso-width-percent:0;mso-height-percent:0;mso-width-relative:margin;mso-height-relative:margin;v-text-anchor:middle" o:gfxdata="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" stroked="f">
                 <v:textbox inset="0,0,0,0">
                   <w:txbxContent>
                     <w:p>
@@ -8682,6 +8668,14 @@
           </mc:Fallback>
         </mc:AlternateContent>
       </w:r>
+    </w:p>
+    <w:p>
+      <w:pPr>
+        <w:rPr>
+          <w:rFonts w:ascii="Times New Roman"/>
+          <w:sz w:val="14"/>
+        </w:rPr>
+      </w:pPr>
       <w:r>
         <w:rPr>
           <w:b/>

</xml_diff>